<commit_message>
push code for preparing rollback if something is wrong
</commit_message>
<xml_diff>
--- a/docs/templates/Mẫu 1a-TT.CGCN- Tờ trình CG Tri thức.docx
+++ b/docs/templates/Mẫu 1a-TT.CGCN- Tờ trình CG Tri thức.docx
@@ -19,217 +19,162 @@
     </w:p>
     <w:tbl>
       <w:tblPr>
-        <w:tblW w:w="9900" w:type="dxa"/>
-        <w:tblInd w:w="-342" w:type="dxa"/>
+        <w:tblW w:w="9072" w:type="dxa"/>
+        <w:tblInd w:w="0" w:type="dxa"/>
+        <w:tblLayout w:type="fixed"/>
         <w:tblLook w:val="04A0" w:firstRow="1" w:lastRow="0" w:firstColumn="1" w:lastColumn="0" w:noHBand="0" w:noVBand="1"/>
-        <w:tblLayout w:type="fixed"/>
       </w:tblPr>
       <w:tblGrid>
-        <w:gridCol w:w="4230"/>
-        <w:gridCol w:w="5670"/>
+        <w:gridCol w:w="3700"/>
+        <w:gridCol w:w="5372"/>
       </w:tblGrid>
       <w:tr>
         <w:trPr>
-          <w:trHeight w:val="1732"/>
+          <w:trHeight w:val="1600"/>
         </w:trPr>
         <w:tc>
           <w:tcPr>
-            <w:tcW w:w="4230" w:type="dxa"/>
+            <w:tcW w:w="3700" w:type="dxa"/>
           </w:tcPr>
           <w:p>
             <w:pPr>
-              <w:pStyle w:val="BodyText"/>
-              <w:spacing w:line="276" w:lineRule="auto"/>
+              <w:spacing w:line="240" w:lineRule="auto" w:after="40"/>
               <w:jc w:val="center"/>
               <w:rPr>
-                <w:b/>
-                <w:sz w:val="26"/>
-                <w:szCs w:val="26"/>
+                <w:rFonts w:ascii="Times New Roman" w:hAnsi="Times New Roman"/>
+                <w:sz w:val="24"/>
+                <w:szCs w:val="24"/>
               </w:rPr>
             </w:pPr>
             <w:r>
               <w:rPr>
-                <w:sz w:val="26"/>
-                <w:szCs w:val="26"/>
+                <w:rFonts w:ascii="Times New Roman" w:hAnsi="Times New Roman"/>
+                <w:sz w:val="24"/>
+                <w:szCs w:val="24"/>
               </w:rPr>
               <w:t>TRƯỜNG ĐH Y DƯỢC CẦN THƠ</w:t>
             </w:r>
           </w:p>
           <w:p>
             <w:pPr>
-              <w:pStyle w:val="BodyText"/>
-              <w:tabs>
-                <w:tab w:val="left" w:pos="630"/>
-              </w:tabs>
-              <w:spacing w:line="276" w:lineRule="auto"/>
+              <w:spacing w:line="240" w:lineRule="auto" w:after="40"/>
               <w:jc w:val="center"/>
               <w:rPr>
+                <w:rFonts w:ascii="Times New Roman" w:hAnsi="Times New Roman"/>
                 <w:b/>
-                <w:sz w:val="26"/>
-                <w:szCs w:val="26"/>
+                <w:sz w:val="24"/>
+                <w:szCs w:val="24"/>
               </w:rPr>
             </w:pPr>
             <w:r>
               <w:rPr>
+                <w:rFonts w:ascii="Times New Roman" w:hAnsi="Times New Roman"/>
                 <w:b/>
-                <w:noProof/>
-                <w:sz w:val="26"/>
-                <w:szCs w:val="26"/>
-                <w:highlight w:val="yellow"/>
-              </w:rPr>
-              <w:pict w14:anchorId="49ACF0D5">
-                <v:shapetype id="_x0000_t32" coordsize="21600,21600" o:spt="32" o:oned="t" path="m,l21600,21600e" filled="f">
-                  <v:path arrowok="t" fillok="f" o:connecttype="none"/>
-                  <o:lock v:ext="edit" shapetype="t"/>
-                </v:shapetype>
-                <v:shape id="_x0000_s1028" type="#_x0000_t32" style="position:absolute;left:0;text-align:left;margin-left:64.05pt;margin-top:14.65pt;width:60.75pt;height:.05pt;z-index:251658240" o:connectortype="straight"/>
-              </w:pict>
+                <w:sz w:val="24"/>
+                <w:szCs w:val="24"/>
+              </w:rPr>
+              <w:t>{don_vi_uppercase}</w:t>
             </w:r>
           </w:p>
           <w:p>
             <w:pPr>
-              <w:pStyle w:val="BodyText"/>
-              <w:tabs>
-                <w:tab w:val="left" w:pos="630"/>
-              </w:tabs>
-              <w:spacing w:line="276" w:lineRule="auto"/>
+              <w:spacing w:line="160" w:lineRule="auto" w:after="60"/>
               <w:jc w:val="center"/>
-              <w:rPr>
-                <w:b/>
-                <w:sz w:val="26"/>
-                <w:szCs w:val="26"/>
-              </w:rPr>
-            </w:pPr>
-          </w:p>
-          <w:p>
-            <w:pPr>
-              <w:pStyle w:val="BodyText"/>
-              <w:spacing w:line="276" w:lineRule="auto"/>
-              <w:jc w:val="center"/>
-              <w:rPr>
-                <w:b/>
-                <w:sz w:val="26"/>
-                <w:szCs w:val="26"/>
-              </w:rPr>
             </w:pPr>
             <w:r>
               <w:rPr>
-                <w:sz w:val="26"/>
-                <w:szCs w:val="26"/>
-              </w:rPr>
-              <w:t>Số: {so_to_trinh}</w:t>
+                <w:rFonts w:ascii="Times New Roman" w:hAnsi="Times New Roman"/>
+                <w:sz w:val="18"/>
+              </w:rPr>
+              <w:t>————————</w:t>
             </w:r>
           </w:p>
           <w:p>
             <w:pPr>
-              <w:pStyle w:val="BodyText"/>
-              <w:tabs>
-                <w:tab w:val="left" w:pos="630"/>
-              </w:tabs>
-              <w:spacing w:line="276" w:lineRule="auto"/>
+              <w:spacing w:line="240" w:lineRule="auto"/>
               <w:jc w:val="center"/>
               <w:rPr>
-                <w:b/>
+                <w:rFonts w:ascii="Times New Roman" w:hAnsi="Times New Roman"/>
                 <w:sz w:val="24"/>
-                <w:szCs w:val="26"/>
+                <w:szCs w:val="24"/>
               </w:rPr>
             </w:pPr>
+            <w:r>
+              <w:rPr>
+                <w:rFonts w:ascii="Times New Roman" w:hAnsi="Times New Roman"/>
+                <w:sz w:val="24"/>
+                <w:szCs w:val="24"/>
+              </w:rPr>
+              <w:t>Số: {so_to_trinh}</w:t>
+            </w:r>
           </w:p>
         </w:tc>
         <w:tc>
           <w:tcPr>
-            <w:tcW w:w="5670" w:type="dxa"/>
+            <w:tcW w:w="5372" w:type="dxa"/>
           </w:tcPr>
           <w:p>
             <w:pPr>
-              <w:pStyle w:val="BodyText"/>
-              <w:tabs>
-                <w:tab w:val="left" w:pos="630"/>
-              </w:tabs>
-              <w:spacing w:line="276" w:lineRule="auto"/>
+              <w:spacing w:line="240" w:lineRule="auto" w:after="40"/>
               <w:jc w:val="center"/>
               <w:rPr>
+                <w:rFonts w:ascii="Times New Roman" w:hAnsi="Times New Roman"/>
                 <w:b/>
-                <w:sz w:val="26"/>
-                <w:szCs w:val="26"/>
+                <w:sz w:val="24"/>
+                <w:szCs w:val="24"/>
               </w:rPr>
             </w:pPr>
             <w:r>
               <w:rPr>
+                <w:rFonts w:ascii="Times New Roman" w:hAnsi="Times New Roman"/>
                 <w:b/>
-                <w:sz w:val="26"/>
-                <w:szCs w:val="26"/>
+                <w:sz w:val="24"/>
+                <w:szCs w:val="24"/>
               </w:rPr>
               <w:t>CỘNG HÒA XÃ HỘI CHỦ NGHĨA VIỆT NAM</w:t>
             </w:r>
           </w:p>
           <w:p>
             <w:pPr>
-              <w:pStyle w:val="BodyText"/>
-              <w:tabs>
-                <w:tab w:val="left" w:pos="630"/>
-              </w:tabs>
-              <w:spacing w:line="276" w:lineRule="auto"/>
+              <w:spacing w:line="240" w:lineRule="auto" w:after="40"/>
               <w:jc w:val="center"/>
               <w:rPr>
+                <w:rFonts w:ascii="Times New Roman" w:hAnsi="Times New Roman"/>
                 <w:b/>
-                <w:szCs w:val="28"/>
+                <w:sz w:val="26"/>
+                <w:szCs w:val="26"/>
               </w:rPr>
             </w:pPr>
             <w:r>
               <w:rPr>
+                <w:rFonts w:ascii="Times New Roman" w:hAnsi="Times New Roman"/>
                 <w:b/>
-                <w:noProof/>
-                <w:szCs w:val="28"/>
-              </w:rPr>
-              <w:pict w14:anchorId="0A9FF958">
-                <v:shape id="_x0000_s1026" type="#_x0000_t32" style="position:absolute;left:0;text-align:left;margin-left:48.3pt;margin-top:16pt;width:176.25pt;height:0;z-index:251657216" o:connectortype="straight"/>
-              </w:pict>
-            </w:r>
-            <w:r>
-              <w:rPr>
-                <w:b/>
-                <w:szCs w:val="28"/>
-              </w:rPr>
-              <w:t xml:space="preserve">Độc lập – Tự do – Hạnh phúc</w:t>
+                <w:sz w:val="26"/>
+                <w:szCs w:val="26"/>
+              </w:rPr>
+              <w:t>Độc lập – Tự do – Hạnh phúc</w:t>
             </w:r>
           </w:p>
           <w:p>
             <w:pPr>
-              <w:pStyle w:val="BodyText"/>
-              <w:tabs>
-                <w:tab w:val="left" w:pos="630"/>
-              </w:tabs>
-              <w:spacing w:line="276" w:lineRule="auto"/>
+              <w:spacing w:line="160" w:lineRule="auto" w:after="60"/>
               <w:jc w:val="center"/>
-              <w:rPr>
-                <w:b/>
-                <w:sz w:val="24"/>
-                <w:szCs w:val="26"/>
-              </w:rPr>
             </w:pPr>
+            <w:r>
+              <w:rPr>
+                <w:rFonts w:ascii="Times New Roman" w:hAnsi="Times New Roman"/>
+                <w:sz w:val="18"/>
+              </w:rPr>
+              <w:t>————————————</w:t>
+            </w:r>
           </w:p>
           <w:p>
             <w:pPr>
-              <w:pStyle w:val="BodyText"/>
-              <w:tabs>
-                <w:tab w:val="left" w:pos="630"/>
-              </w:tabs>
-              <w:spacing w:line="276" w:lineRule="auto"/>
+              <w:spacing w:line="240" w:lineRule="auto"/>
               <w:jc w:val="center"/>
               <w:rPr>
-                <w:b/>
-                <w:sz w:val="24"/>
-                <w:szCs w:val="26"/>
-              </w:rPr>
-            </w:pPr>
-          </w:p>
-          <w:p>
-            <w:pPr>
-              <w:spacing w:line="276" w:lineRule="auto"/>
-              <w:jc w:val="center"/>
-              <w:rPr>
-                <w:b/>
+                <w:rFonts w:ascii="Times New Roman" w:hAnsi="Times New Roman"/>
+                <w:i/>
                 <w:sz w:val="26"/>
                 <w:szCs w:val="26"/>
               </w:rPr>
@@ -326,7 +271,6 @@
           <w:b/>
           <w:i/>
           <w:iCs/>
-          <w:color w:val="FF0000"/>
           <w:sz w:val="26"/>
           <w:szCs w:val="26"/>
         </w:rPr>
@@ -1048,929 +992,500 @@
     </w:p>
     <w:tbl>
       <w:tblPr>
-        <w:tblW w:w="8840" w:type="dxa"/>
-        <w:tblInd w:w="-108" w:type="dxa"/>
+        <w:tblW w:w="9072" w:type="dxa"/>
+        <w:tblInd w:w="0" w:type="dxa"/>
         <w:tblLayout w:type="fixed"/>
-        <w:tblLook w:val="0000" w:firstRow="0" w:lastRow="0" w:firstColumn="0" w:lastColumn="0" w:noHBand="0" w:noVBand="0"/>
+        <w:tblLook w:val="0000"/>
       </w:tblPr>
       <w:tblGrid>
-        <w:gridCol w:w="3096"/>
-        <w:gridCol w:w="2363"/>
-        <w:gridCol w:w="3381"/>
+        <w:gridCol w:w="4200"/>
+        <w:gridCol w:w="672"/>
+        <w:gridCol w:w="4200"/>
       </w:tblGrid>
+      <!-- Hàng 1: Trưởng đơn vị & Chủ nhiệm đề tài -->
       <w:tr>
         <w:trPr>
-          <w:trHeight w:val="305"/>
+          <w:cantSplit/>
         </w:trPr>
         <w:tc>
           <w:tcPr>
-            <w:tcW w:w="3096" w:type="dxa"/>
+            <w:tcW w:w="4200" w:type="dxa"/>
           </w:tcPr>
           <w:p>
             <w:pPr>
-              <w:spacing w:after="0" w:line="276" w:lineRule="auto"/>
-              <w:ind w:left="1" w:hanging="3"/>
+              <w:spacing w:line="240" w:lineRule="auto" w:after="20"/>
               <w:jc w:val="center"/>
               <w:rPr>
-                <w:rFonts w:ascii="Times New Roman" w:eastAsia="Times New Roman" w:hAnsi="Times New Roman"/>
+                <w:rFonts w:ascii="Times New Roman" w:hAnsi="Times New Roman"/>
                 <w:b/>
-                <w:sz w:val="26"/>
-                <w:szCs w:val="26"/>
+                <w:sz w:val="24"/>
+                <w:szCs w:val="24"/>
               </w:rPr>
             </w:pPr>
             <w:r>
               <w:rPr>
-                <w:rFonts w:ascii="Times New Roman" w:eastAsia="Times New Roman" w:hAnsi="Times New Roman"/>
+                <w:rFonts w:ascii="Times New Roman" w:hAnsi="Times New Roman"/>
                 <w:b/>
-                <w:sz w:val="26"/>
-                <w:szCs w:val="26"/>
-              </w:rPr>
-              <w:t xml:space="preserve">Trưởng đơn vị</w:t>
+                <w:sz w:val="24"/>
+                <w:szCs w:val="24"/>
+              </w:rPr>
+              <w:t>TRƯỞNG ĐƠN VỊ</w:t>
+            </w:r>
+          </w:p>
+          <w:p>
+            <w:pPr>
+              <w:spacing w:line="240" w:lineRule="auto" w:after="400"/>
+              <w:jc w:val="center"/>
+              <w:rPr>
+                <w:rFonts w:ascii="Times New Roman" w:hAnsi="Times New Roman"/>
+                <w:i/>
+                <w:sz w:val="22"/>
+                <w:szCs w:val="22"/>
+              </w:rPr>
+            </w:pPr>
+            <w:r>
+              <w:rPr>
+                <w:rFonts w:ascii="Times New Roman" w:hAnsi="Times New Roman"/>
+                <w:i/>
+                <w:sz w:val="22"/>
+                <w:szCs w:val="22"/>
+              </w:rPr>
+              <w:t>(Ký, ghi rõ họ tên)</w:t>
+            </w:r>
+          </w:p>
+          <w:p>
+            <w:pPr>
+              <w:spacing w:line="240" w:lineRule="auto" w:after="80"/>
+              <w:jc w:val="center"/>
+              <w:rPr>
+                <w:rFonts w:ascii="Times New Roman" w:hAnsi="Times New Roman"/>
+                <w:b/>
+                <w:sz w:val="24"/>
+                <w:szCs w:val="24"/>
+              </w:rPr>
+            </w:pPr>
+            <w:r>
+              <w:rPr>
+                <w:rFonts w:ascii="Times New Roman" w:hAnsi="Times New Roman"/>
+                <w:b/>
+                <w:sz w:val="24"/>
+                <w:szCs w:val="24"/>
+              </w:rPr>
+              <w:t>{truong_don_vi}</w:t>
             </w:r>
           </w:p>
         </w:tc>
         <w:tc>
           <w:tcPr>
-            <w:tcW w:w="2363" w:type="dxa"/>
+            <w:tcW w:w="672" w:type="dxa"/>
           </w:tcPr>
           <w:p>
             <w:pPr>
-              <w:spacing w:after="0" w:line="276" w:lineRule="auto"/>
-              <w:ind w:left="1" w:hanging="3"/>
-              <w:jc w:val="center"/>
-              <w:rPr>
-                <w:rFonts w:ascii="Times New Roman" w:eastAsia="Times New Roman" w:hAnsi="Times New Roman"/>
-                <w:b/>
-                <w:sz w:val="26"/>
-                <w:szCs w:val="26"/>
-              </w:rPr>
+              <w:spacing w:after="0"/>
             </w:pPr>
           </w:p>
         </w:tc>
         <w:tc>
           <w:tcPr>
-            <w:tcW w:w="3381" w:type="dxa"/>
+            <w:tcW w:w="4200" w:type="dxa"/>
           </w:tcPr>
           <w:p>
             <w:pPr>
-              <w:spacing w:after="0" w:line="276" w:lineRule="auto"/>
-              <w:ind w:left="1" w:hanging="3"/>
+              <w:spacing w:line="240" w:lineRule="auto" w:after="20"/>
               <w:jc w:val="center"/>
               <w:rPr>
-                <w:rFonts w:ascii="Times New Roman" w:eastAsia="Times New Roman" w:hAnsi="Times New Roman"/>
+                <w:rFonts w:ascii="Times New Roman" w:hAnsi="Times New Roman"/>
                 <w:b/>
-                <w:sz w:val="26"/>
-                <w:szCs w:val="26"/>
+                <w:sz w:val="24"/>
+                <w:szCs w:val="24"/>
               </w:rPr>
             </w:pPr>
             <w:r>
               <w:rPr>
-                <w:rFonts w:ascii="Times New Roman" w:eastAsia="Times New Roman" w:hAnsi="Times New Roman"/>
+                <w:rFonts w:ascii="Times New Roman" w:hAnsi="Times New Roman"/>
                 <w:b/>
-                <w:sz w:val="26"/>
-                <w:szCs w:val="26"/>
-              </w:rPr>
-              <w:t xml:space="preserve">Cá nhân/Chủ nhiệm đề tài </w:t>
+                <w:sz w:val="24"/>
+                <w:szCs w:val="24"/>
+              </w:rPr>
+              <w:t>CÁ NHÂN/CHỦ NHIỆM ĐỀ TÀI</w:t>
+            </w:r>
+          </w:p>
+          <w:p>
+            <w:pPr>
+              <w:spacing w:line="240" w:lineRule="auto" w:after="400"/>
+              <w:jc w:val="center"/>
+              <w:rPr>
+                <w:rFonts w:ascii="Times New Roman" w:hAnsi="Times New Roman"/>
+                <w:i/>
+                <w:sz w:val="22"/>
+                <w:szCs w:val="22"/>
+              </w:rPr>
+            </w:pPr>
+            <w:r>
+              <w:rPr>
+                <w:rFonts w:ascii="Times New Roman" w:hAnsi="Times New Roman"/>
+                <w:i/>
+                <w:sz w:val="22"/>
+                <w:szCs w:val="22"/>
+              </w:rPr>
+              <w:t>(Ký, ghi rõ họ tên)</w:t>
+            </w:r>
+          </w:p>
+          <w:p>
+            <w:pPr>
+              <w:spacing w:line="240" w:lineRule="auto" w:after="80"/>
+              <w:jc w:val="center"/>
+              <w:rPr>
+                <w:rFonts w:ascii="Times New Roman" w:hAnsi="Times New Roman"/>
+                <w:b/>
+                <w:sz w:val="24"/>
+                <w:szCs w:val="24"/>
+              </w:rPr>
+            </w:pPr>
+            <w:r>
+              <w:rPr>
+                <w:rFonts w:ascii="Times New Roman" w:hAnsi="Times New Roman"/>
+                <w:b/>
+                <w:sz w:val="24"/>
+                <w:szCs w:val="24"/>
+              </w:rPr>
+              <w:t>{ho_ten}</w:t>
             </w:r>
           </w:p>
         </w:tc>
       </w:tr>
+      <!-- Hàng 2: Phòng KH&CN & Phòng TCKT -->
       <w:tr>
         <w:trPr>
-          <w:trHeight w:val="305"/>
+          <w:cantSplit/>
         </w:trPr>
         <w:tc>
           <w:tcPr>
-            <w:tcW w:w="3096" w:type="dxa"/>
+            <w:tcW w:w="4200" w:type="dxa"/>
           </w:tcPr>
           <w:p>
             <w:pPr>
-              <w:spacing w:after="0" w:line="276" w:lineRule="auto"/>
-              <w:ind w:left="1" w:hanging="3"/>
-              <w:jc w:val="both"/>
-              <w:rPr>
-                <w:rFonts w:ascii="Times New Roman" w:eastAsia="Times New Roman" w:hAnsi="Times New Roman"/>
-                <w:sz w:val="26"/>
-                <w:szCs w:val="26"/>
-              </w:rPr>
+              <w:spacing w:line="240" w:lineRule="auto" w:before="120" w:after="20"/>
+              <w:jc w:val="center"/>
+              <w:rPr>
+                <w:rFonts w:ascii="Times New Roman" w:hAnsi="Times New Roman"/>
+                <w:b/>
+                <w:sz w:val="24"/>
+                <w:szCs w:val="24"/>
+              </w:rPr>
+            </w:pPr>
+            <w:r>
+              <w:rPr>
+                <w:rFonts w:ascii="Times New Roman" w:hAnsi="Times New Roman"/>
+                <w:b/>
+                <w:sz w:val="24"/>
+                <w:szCs w:val="24"/>
+              </w:rPr>
+              <w:t>PHÒNG KH&amp;CN</w:t>
+            </w:r>
+          </w:p>
+          <w:p>
+            <w:pPr>
+              <w:spacing w:line="240" w:lineRule="auto" w:after="400"/>
+              <w:jc w:val="center"/>
+              <w:rPr>
+                <w:rFonts w:ascii="Times New Roman" w:hAnsi="Times New Roman"/>
+                <w:i/>
+                <w:sz w:val="22"/>
+                <w:szCs w:val="22"/>
+              </w:rPr>
+            </w:pPr>
+            <w:r>
+              <w:rPr>
+                <w:rFonts w:ascii="Times New Roman" w:hAnsi="Times New Roman"/>
+                <w:i/>
+                <w:sz w:val="22"/>
+                <w:szCs w:val="22"/>
+              </w:rPr>
+              <w:t>(Ký, ghi rõ họ tên)</w:t>
+            </w:r>
+          </w:p>
+          <w:p>
+            <w:pPr>
+              <w:spacing w:line="240" w:lineRule="auto" w:after="80"/>
+              <w:jc w:val="center"/>
+              <w:rPr>
+                <w:rFonts w:ascii="Times New Roman" w:hAnsi="Times New Roman"/>
+                <w:sz w:val="22"/>
+              </w:rPr>
+            </w:pPr>
+            <w:r>
+              <w:rPr>
+                <w:rFonts w:ascii="Times New Roman" w:hAnsi="Times New Roman"/>
+                <w:sz w:val="22"/>
+              </w:rPr>
+              <w:t>........................................</w:t>
+            </w:r>
+          </w:p>
+        </w:tc>
+        <w:tc>
+          <w:tcPr>
+            <w:tcW w:w="672" w:type="dxa"/>
+          </w:tcPr>
+          <w:p>
+            <w:pPr>
+              <w:spacing w:after="0"/>
             </w:pPr>
           </w:p>
         </w:tc>
         <w:tc>
           <w:tcPr>
-            <w:tcW w:w="2363" w:type="dxa"/>
+            <w:tcW w:w="4200" w:type="dxa"/>
           </w:tcPr>
           <w:p>
             <w:pPr>
-              <w:spacing w:after="0" w:line="276" w:lineRule="auto"/>
-              <w:ind w:left="1" w:hanging="3"/>
-              <w:jc w:val="both"/>
-              <w:rPr>
-                <w:rFonts w:ascii="Times New Roman" w:eastAsia="Times New Roman" w:hAnsi="Times New Roman"/>
-                <w:sz w:val="26"/>
-                <w:szCs w:val="26"/>
-              </w:rPr>
+              <w:spacing w:line="240" w:lineRule="auto" w:before="120" w:after="20"/>
+              <w:jc w:val="center"/>
+              <w:rPr>
+                <w:rFonts w:ascii="Times New Roman" w:hAnsi="Times New Roman"/>
+                <w:b/>
+                <w:sz w:val="24"/>
+                <w:szCs w:val="24"/>
+              </w:rPr>
+            </w:pPr>
+            <w:r>
+              <w:rPr>
+                <w:rFonts w:ascii="Times New Roman" w:hAnsi="Times New Roman"/>
+                <w:b/>
+                <w:sz w:val="24"/>
+                <w:szCs w:val="24"/>
+              </w:rPr>
+              <w:t>PHÒNG KHTC</w:t>
+            </w:r>
+          </w:p>
+          <w:p>
+            <w:pPr>
+              <w:spacing w:line="240" w:lineRule="auto" w:after="400"/>
+              <w:jc w:val="center"/>
+              <w:rPr>
+                <w:rFonts w:ascii="Times New Roman" w:hAnsi="Times New Roman"/>
+                <w:i/>
+                <w:sz w:val="22"/>
+                <w:szCs w:val="22"/>
+              </w:rPr>
+            </w:pPr>
+            <w:r>
+              <w:rPr>
+                <w:rFonts w:ascii="Times New Roman" w:hAnsi="Times New Roman"/>
+                <w:i/>
+                <w:sz w:val="22"/>
+                <w:szCs w:val="22"/>
+              </w:rPr>
+              <w:t>(Ký, ghi rõ họ tên)</w:t>
+            </w:r>
+          </w:p>
+          <w:p>
+            <w:pPr>
+              <w:spacing w:line="240" w:lineRule="auto" w:after="80"/>
+              <w:jc w:val="center"/>
+              <w:rPr>
+                <w:rFonts w:ascii="Times New Roman" w:hAnsi="Times New Roman"/>
+                <w:sz w:val="22"/>
+              </w:rPr>
+            </w:pPr>
+            <w:r>
+              <w:rPr>
+                <w:rFonts w:ascii="Times New Roman" w:hAnsi="Times New Roman"/>
+                <w:sz w:val="22"/>
+              </w:rPr>
+              <w:t>........................................</w:t>
+            </w:r>
+          </w:p>
+        </w:tc>
+      </w:tr>
+      <!-- Hàng 3: Nơi nhận & Hiệu trưởng -->
+      <w:tr>
+        <w:trPr>
+          <w:cantSplit/>
+        </w:trPr>
+        <w:tc>
+          <w:tcPr>
+            <w:tcW w:w="4200" w:type="dxa"/>
+          </w:tcPr>
+          <w:p>
+            <w:pPr>
+              <w:spacing w:line="200" w:lineRule="auto" w:before="120" w:after="10"/>
+              <w:rPr>
+                <w:rFonts w:ascii="Times New Roman" w:hAnsi="Times New Roman"/>
+                <w:b/>
+                <w:i/>
+                <w:sz w:val="22"/>
+                <w:szCs w:val="22"/>
+              </w:rPr>
+            </w:pPr>
+            <w:r>
+              <w:rPr>
+                <w:rFonts w:ascii="Times New Roman" w:hAnsi="Times New Roman"/>
+                <w:b/>
+                <w:i/>
+                <w:sz w:val="22"/>
+                <w:szCs w:val="22"/>
+              </w:rPr>
+              <w:t>Nơi nhận:</w:t>
+            </w:r>
+          </w:p>
+          <w:p>
+            <w:pPr>
+              <w:spacing w:line="180" w:lineRule="auto" w:after="0"/>
+              <w:rPr>
+                <w:rFonts w:ascii="Times New Roman" w:hAnsi="Times New Roman"/>
+                <w:sz w:val="19"/>
+                <w:szCs w:val="19"/>
+              </w:rPr>
+            </w:pPr>
+            <w:r>
+              <w:rPr>
+                <w:rFonts w:ascii="Times New Roman" w:hAnsi="Times New Roman"/>
+                <w:sz w:val="19"/>
+                <w:szCs w:val="19"/>
+              </w:rPr>
+              <w:t>- Ban Giám Hiệu (để b/c);</w:t>
+            </w:r>
+          </w:p>
+          <w:p>
+            <w:pPr>
+              <w:spacing w:line="180" w:lineRule="auto" w:after="0"/>
+              <w:rPr>
+                <w:rFonts w:ascii="Times New Roman" w:hAnsi="Times New Roman"/>
+                <w:sz w:val="19"/>
+                <w:szCs w:val="19"/>
+              </w:rPr>
+            </w:pPr>
+            <w:r>
+              <w:rPr>
+                <w:rFonts w:ascii="Times New Roman" w:hAnsi="Times New Roman"/>
+                <w:sz w:val="19"/>
+                <w:szCs w:val="19"/>
+              </w:rPr>
+              <w:t>- Phòng KH&amp;CN, TCKT;</w:t>
+            </w:r>
+          </w:p>
+          <w:p>
+            <w:pPr>
+              <w:spacing w:line="180" w:lineRule="auto" w:after="0"/>
+              <w:rPr>
+                <w:rFonts w:ascii="Times New Roman" w:hAnsi="Times New Roman"/>
+                <w:sz w:val="19"/>
+                <w:szCs w:val="19"/>
+              </w:rPr>
+            </w:pPr>
+            <w:r>
+              <w:rPr>
+                <w:rFonts w:ascii="Times New Roman" w:hAnsi="Times New Roman"/>
+                <w:sz w:val="19"/>
+                <w:szCs w:val="19"/>
+              </w:rPr>
+              <w:t>- Đơn vị tiếp nhận CG;</w:t>
+            </w:r>
+          </w:p>
+          <w:p>
+            <w:pPr>
+              <w:spacing w:line="180" w:lineRule="auto" w:after="0"/>
+              <w:rPr>
+                <w:rFonts w:ascii="Times New Roman" w:hAnsi="Times New Roman"/>
+                <w:sz w:val="19"/>
+                <w:szCs w:val="19"/>
+              </w:rPr>
+            </w:pPr>
+            <w:r>
+              <w:rPr>
+                <w:rFonts w:ascii="Times New Roman" w:hAnsi="Times New Roman"/>
+                <w:sz w:val="19"/>
+                <w:szCs w:val="19"/>
+              </w:rPr>
+              <w:t>- Lưu: VT, KHCN.</w:t>
+            </w:r>
+          </w:p>
+        </w:tc>
+        <w:tc>
+          <w:tcPr>
+            <w:tcW w:w="672" w:type="dxa"/>
+          </w:tcPr>
+          <w:p>
+            <w:pPr>
+              <w:spacing w:after="0"/>
             </w:pPr>
           </w:p>
         </w:tc>
         <w:tc>
           <w:tcPr>
-            <w:tcW w:w="3381" w:type="dxa"/>
+            <w:tcW w:w="4200" w:type="dxa"/>
           </w:tcPr>
           <w:p>
             <w:pPr>
-              <w:spacing w:after="0" w:line="276" w:lineRule="auto"/>
-              <w:ind w:left="1" w:hanging="3"/>
-              <w:jc w:val="both"/>
-              <w:rPr>
-                <w:rFonts w:ascii="Times New Roman" w:eastAsia="Times New Roman" w:hAnsi="Times New Roman"/>
-                <w:sz w:val="26"/>
-                <w:szCs w:val="26"/>
+              <w:spacing w:line="240" w:lineRule="auto" w:before="120" w:after="20"/>
+              <w:jc w:val="center"/>
+              <w:rPr>
+                <w:rFonts w:ascii="Times New Roman" w:hAnsi="Times New Roman"/>
+                <w:b/>
+                <w:sz w:val="24"/>
+                <w:szCs w:val="24"/>
               </w:rPr>
             </w:pPr>
+            <w:r>
+              <w:rPr>
+                <w:rFonts w:ascii="Times New Roman" w:hAnsi="Times New Roman"/>
+                <w:b/>
+                <w:sz w:val="24"/>
+                <w:szCs w:val="24"/>
+              </w:rPr>
+              <w:t>HIỆU TRƯỞNG</w:t>
+            </w:r>
           </w:p>
-        </w:tc>
-      </w:tr>
-      <w:tr>
-        <w:trPr>
-          <w:trHeight w:val="305"/>
-        </w:trPr>
-        <w:tc>
-          <w:tcPr>
-            <w:tcW w:w="3096" w:type="dxa"/>
-          </w:tcPr>
           <w:p>
             <w:pPr>
-              <w:spacing w:after="0" w:line="276" w:lineRule="auto"/>
-              <w:ind w:left="1" w:hanging="3"/>
-              <w:jc w:val="both"/>
-              <w:rPr>
-                <w:rFonts w:ascii="Times New Roman" w:eastAsia="Times New Roman" w:hAnsi="Times New Roman"/>
-                <w:sz w:val="26"/>
-                <w:szCs w:val="26"/>
+              <w:spacing w:line="240" w:lineRule="auto" w:after="400"/>
+              <w:jc w:val="center"/>
+              <w:rPr>
+                <w:rFonts w:ascii="Times New Roman" w:hAnsi="Times New Roman"/>
+                <w:i/>
+                <w:sz w:val="22"/>
+                <w:szCs w:val="22"/>
               </w:rPr>
             </w:pPr>
+            <w:r>
+              <w:rPr>
+                <w:rFonts w:ascii="Times New Roman" w:hAnsi="Times New Roman"/>
+                <w:i/>
+                <w:sz w:val="22"/>
+                <w:szCs w:val="22"/>
+              </w:rPr>
+              <w:t>(Ký, đóng dấu)</w:t>
+            </w:r>
           </w:p>
-        </w:tc>
-        <w:tc>
-          <w:tcPr>
-            <w:tcW w:w="2363" w:type="dxa"/>
-          </w:tcPr>
           <w:p>
             <w:pPr>
-              <w:spacing w:after="0" w:line="276" w:lineRule="auto"/>
-              <w:ind w:left="1" w:hanging="3"/>
-              <w:jc w:val="both"/>
-              <w:rPr>
-                <w:rFonts w:ascii="Times New Roman" w:eastAsia="Times New Roman" w:hAnsi="Times New Roman"/>
-                <w:sz w:val="26"/>
-                <w:szCs w:val="26"/>
-              </w:rPr>
-            </w:pPr>
-          </w:p>
-        </w:tc>
-        <w:tc>
-          <w:tcPr>
-            <w:tcW w:w="3381" w:type="dxa"/>
-          </w:tcPr>
-          <w:p>
-            <w:pPr>
-              <w:spacing w:after="0" w:line="276" w:lineRule="auto"/>
-              <w:ind w:left="1" w:hanging="3"/>
-              <w:jc w:val="both"/>
-              <w:rPr>
-                <w:rFonts w:ascii="Times New Roman" w:eastAsia="Times New Roman" w:hAnsi="Times New Roman"/>
-                <w:sz w:val="26"/>
-                <w:szCs w:val="26"/>
-              </w:rPr>
-            </w:pPr>
-          </w:p>
-        </w:tc>
-      </w:tr>
-      <w:tr>
-        <w:trPr>
-          <w:trHeight w:val="305"/>
-        </w:trPr>
-        <w:tc>
-          <w:tcPr>
-            <w:tcW w:w="3096" w:type="dxa"/>
-          </w:tcPr>
-          <w:p>
-            <w:pPr>
-              <w:spacing w:after="0" w:line="276" w:lineRule="auto"/>
-              <w:ind w:left="1" w:hanging="3"/>
-              <w:jc w:val="both"/>
-              <w:rPr>
-                <w:rFonts w:ascii="Times New Roman" w:eastAsia="Times New Roman" w:hAnsi="Times New Roman"/>
-                <w:sz w:val="26"/>
-                <w:szCs w:val="26"/>
-              </w:rPr>
-            </w:pPr>
-          </w:p>
-        </w:tc>
-        <w:tc>
-          <w:tcPr>
-            <w:tcW w:w="2363" w:type="dxa"/>
-          </w:tcPr>
-          <w:p>
-            <w:pPr>
-              <w:spacing w:after="0" w:line="276" w:lineRule="auto"/>
-              <w:ind w:left="1" w:hanging="3"/>
-              <w:jc w:val="both"/>
-              <w:rPr>
-                <w:rFonts w:ascii="Times New Roman" w:eastAsia="Times New Roman" w:hAnsi="Times New Roman"/>
-                <w:sz w:val="26"/>
-                <w:szCs w:val="26"/>
-              </w:rPr>
-            </w:pPr>
-          </w:p>
-        </w:tc>
-        <w:tc>
-          <w:tcPr>
-            <w:tcW w:w="3381" w:type="dxa"/>
-          </w:tcPr>
-          <w:p>
-            <w:pPr>
-              <w:spacing w:after="0" w:line="276" w:lineRule="auto"/>
-              <w:ind w:left="1" w:hanging="3"/>
-              <w:jc w:val="both"/>
-              <w:rPr>
-                <w:rFonts w:ascii="Times New Roman" w:eastAsia="Times New Roman" w:hAnsi="Times New Roman"/>
-                <w:sz w:val="26"/>
-                <w:szCs w:val="26"/>
-              </w:rPr>
-            </w:pPr>
-          </w:p>
-        </w:tc>
-      </w:tr>
-      <w:tr>
-        <w:trPr>
-          <w:trHeight w:val="305"/>
-        </w:trPr>
-        <w:tc>
-          <w:tcPr>
-            <w:tcW w:w="3096" w:type="dxa"/>
-          </w:tcPr>
-          <w:p>
-            <w:pPr>
-              <w:spacing w:after="0" w:line="276" w:lineRule="auto"/>
-              <w:ind w:left="1" w:hanging="3"/>
-              <w:jc w:val="both"/>
-              <w:rPr>
-                <w:rFonts w:ascii="Times New Roman" w:eastAsia="Times New Roman" w:hAnsi="Times New Roman"/>
-                <w:sz w:val="26"/>
-                <w:szCs w:val="26"/>
-              </w:rPr>
-            </w:pPr>
-            <w:pPr>
+              <w:spacing w:line="240" w:lineRule="auto" w:after="80"/>
               <w:jc w:val="center"/>
+              <w:rPr>
+                <w:rFonts w:ascii="Times New Roman" w:hAnsi="Times New Roman"/>
+                <w:sz w:val="22"/>
+              </w:rPr>
             </w:pPr>
             <w:r>
               <w:rPr>
-                <w:rFonts w:ascii="Times New Roman" w:hAnsi="Times New Roman" w:cs="Times New Roman"/>
-                <w:sz w:val="26"/>
-                <w:b/>
-              </w:rPr>
-              <w:t xml:space="preserve">{truong_don_vi}</w:t>
+                <w:rFonts w:ascii="Times New Roman" w:hAnsi="Times New Roman"/>
+                <w:sz w:val="22"/>
+              </w:rPr>
+              <w:t>........................................</w:t>
             </w:r>
-          </w:p>
-        </w:tc>
-        <w:tc>
-          <w:tcPr>
-            <w:tcW w:w="2363" w:type="dxa"/>
-          </w:tcPr>
-          <w:p>
-            <w:pPr>
-              <w:spacing w:after="0" w:line="276" w:lineRule="auto"/>
-              <w:ind w:left="1" w:hanging="3"/>
-              <w:jc w:val="both"/>
-              <w:rPr>
-                <w:rFonts w:ascii="Times New Roman" w:eastAsia="Times New Roman" w:hAnsi="Times New Roman"/>
-                <w:sz w:val="26"/>
-                <w:szCs w:val="26"/>
-              </w:rPr>
-            </w:pPr>
-          </w:p>
-        </w:tc>
-        <w:tc>
-          <w:tcPr>
-            <w:tcW w:w="3381" w:type="dxa"/>
-          </w:tcPr>
-          <w:p>
-            <w:pPr>
-              <w:spacing w:after="0" w:line="276" w:lineRule="auto"/>
-              <w:ind w:left="1" w:hanging="3"/>
-              <w:jc w:val="both"/>
-              <w:rPr>
-                <w:rFonts w:ascii="Times New Roman" w:eastAsia="Times New Roman" w:hAnsi="Times New Roman"/>
-                <w:sz w:val="26"/>
-                <w:szCs w:val="26"/>
-              </w:rPr>
-            </w:pPr>
-            <w:pPr>
-              <w:jc w:val="center"/>
-            </w:pPr>
-            <w:r>
-              <w:rPr>
-                <w:rFonts w:ascii="Times New Roman" w:hAnsi="Times New Roman" w:cs="Times New Roman"/>
-                <w:sz w:val="26"/>
-                <w:b/>
-              </w:rPr>
-              <w:t xml:space="preserve">{ho_ten}</w:t>
-            </w:r>
-          </w:p>
-        </w:tc>
-      </w:tr>
-      <w:tr>
-        <w:trPr>
-          <w:trHeight w:val="305"/>
-        </w:trPr>
-        <w:tc>
-          <w:tcPr>
-            <w:tcW w:w="3096" w:type="dxa"/>
-          </w:tcPr>
-          <w:p>
-            <w:pPr>
-              <w:spacing w:after="0" w:line="276" w:lineRule="auto"/>
-              <w:ind w:left="1" w:hanging="3"/>
-              <w:jc w:val="center"/>
-              <w:rPr>
-                <w:rFonts w:ascii="Times New Roman" w:eastAsia="Times New Roman" w:hAnsi="Times New Roman"/>
-                <w:sz w:val="26"/>
-                <w:szCs w:val="26"/>
-              </w:rPr>
-            </w:pPr>
-            <w:r>
-              <w:rPr>
-                <w:rFonts w:ascii="Times New Roman" w:eastAsia="Times New Roman" w:hAnsi="Times New Roman"/>
-                <w:b/>
-                <w:sz w:val="26"/>
-                <w:szCs w:val="26"/>
-              </w:rPr>
-              <w:t xml:space="preserve">Phòng KH&amp;CN</w:t>
-            </w:r>
-          </w:p>
-        </w:tc>
-        <w:tc>
-          <w:tcPr>
-            <w:tcW w:w="2363" w:type="dxa"/>
-          </w:tcPr>
-          <w:p>
-            <w:pPr>
-              <w:spacing w:after="0" w:line="276" w:lineRule="auto"/>
-              <w:ind w:left="1" w:hanging="3"/>
-              <w:jc w:val="center"/>
-              <w:rPr>
-                <w:rFonts w:ascii="Times New Roman" w:eastAsia="Times New Roman" w:hAnsi="Times New Roman"/>
-                <w:b/>
-                <w:sz w:val="26"/>
-                <w:szCs w:val="26"/>
-              </w:rPr>
-            </w:pPr>
-          </w:p>
-        </w:tc>
-        <w:tc>
-          <w:tcPr>
-            <w:tcW w:w="3381" w:type="dxa"/>
-          </w:tcPr>
-          <w:p>
-            <w:pPr>
-              <w:spacing w:after="0" w:line="276" w:lineRule="auto"/>
-              <w:ind w:left="1" w:hanging="3"/>
-              <w:jc w:val="center"/>
-              <w:rPr>
-                <w:rFonts w:ascii="Times New Roman" w:eastAsia="Times New Roman" w:hAnsi="Times New Roman"/>
-                <w:sz w:val="26"/>
-                <w:szCs w:val="26"/>
-              </w:rPr>
-            </w:pPr>
-            <w:r>
-              <w:rPr>
-                <w:rFonts w:ascii="Times New Roman" w:eastAsia="Times New Roman" w:hAnsi="Times New Roman"/>
-                <w:b/>
-                <w:sz w:val="26"/>
-                <w:szCs w:val="26"/>
-              </w:rPr>
-              <w:t xml:space="preserve">Phòng TCKT</w:t>
-            </w:r>
-          </w:p>
-        </w:tc>
-      </w:tr>
-      <w:tr>
-        <w:trPr>
-          <w:trHeight w:val="305"/>
-        </w:trPr>
-        <w:tc>
-          <w:tcPr>
-            <w:tcW w:w="3096" w:type="dxa"/>
-          </w:tcPr>
-          <w:p>
-            <w:pPr>
-              <w:spacing w:after="0" w:line="276" w:lineRule="auto"/>
-              <w:ind w:left="1" w:hanging="3"/>
-              <w:jc w:val="both"/>
-              <w:rPr>
-                <w:rFonts w:ascii="Times New Roman" w:eastAsia="Times New Roman" w:hAnsi="Times New Roman"/>
-                <w:sz w:val="26"/>
-                <w:szCs w:val="26"/>
-              </w:rPr>
-            </w:pPr>
-          </w:p>
-        </w:tc>
-        <w:tc>
-          <w:tcPr>
-            <w:tcW w:w="2363" w:type="dxa"/>
-          </w:tcPr>
-          <w:p>
-            <w:pPr>
-              <w:spacing w:after="0" w:line="276" w:lineRule="auto"/>
-              <w:ind w:left="1" w:hanging="3"/>
-              <w:jc w:val="both"/>
-              <w:rPr>
-                <w:rFonts w:ascii="Times New Roman" w:eastAsia="Times New Roman" w:hAnsi="Times New Roman"/>
-                <w:sz w:val="26"/>
-                <w:szCs w:val="26"/>
-              </w:rPr>
-            </w:pPr>
-          </w:p>
-        </w:tc>
-        <w:tc>
-          <w:tcPr>
-            <w:tcW w:w="3381" w:type="dxa"/>
-          </w:tcPr>
-          <w:p>
-            <w:pPr>
-              <w:spacing w:after="0" w:line="276" w:lineRule="auto"/>
-              <w:ind w:left="1" w:hanging="3"/>
-              <w:jc w:val="both"/>
-              <w:rPr>
-                <w:rFonts w:ascii="Times New Roman" w:eastAsia="Times New Roman" w:hAnsi="Times New Roman"/>
-                <w:sz w:val="26"/>
-                <w:szCs w:val="26"/>
-              </w:rPr>
-            </w:pPr>
-          </w:p>
-        </w:tc>
-      </w:tr>
-      <w:tr>
-        <w:trPr>
-          <w:trHeight w:val="305"/>
-        </w:trPr>
-        <w:tc>
-          <w:tcPr>
-            <w:tcW w:w="3096" w:type="dxa"/>
-          </w:tcPr>
-          <w:p>
-            <w:pPr>
-              <w:spacing w:after="0" w:line="276" w:lineRule="auto"/>
-              <w:ind w:left="1" w:hanging="3"/>
-              <w:jc w:val="both"/>
-              <w:rPr>
-                <w:rFonts w:ascii="Times New Roman" w:eastAsia="Times New Roman" w:hAnsi="Times New Roman"/>
-                <w:sz w:val="26"/>
-                <w:szCs w:val="26"/>
-              </w:rPr>
-            </w:pPr>
-          </w:p>
-        </w:tc>
-        <w:tc>
-          <w:tcPr>
-            <w:tcW w:w="2363" w:type="dxa"/>
-          </w:tcPr>
-          <w:p>
-            <w:pPr>
-              <w:spacing w:after="0" w:line="276" w:lineRule="auto"/>
-              <w:ind w:left="1" w:hanging="3"/>
-              <w:jc w:val="both"/>
-              <w:rPr>
-                <w:rFonts w:ascii="Times New Roman" w:eastAsia="Times New Roman" w:hAnsi="Times New Roman"/>
-                <w:sz w:val="26"/>
-                <w:szCs w:val="26"/>
-              </w:rPr>
-            </w:pPr>
-          </w:p>
-        </w:tc>
-        <w:tc>
-          <w:tcPr>
-            <w:tcW w:w="3381" w:type="dxa"/>
-          </w:tcPr>
-          <w:p>
-            <w:pPr>
-              <w:spacing w:after="0" w:line="276" w:lineRule="auto"/>
-              <w:ind w:left="1" w:hanging="3"/>
-              <w:jc w:val="both"/>
-              <w:rPr>
-                <w:rFonts w:ascii="Times New Roman" w:eastAsia="Times New Roman" w:hAnsi="Times New Roman"/>
-                <w:sz w:val="26"/>
-                <w:szCs w:val="26"/>
-              </w:rPr>
-            </w:pPr>
-          </w:p>
-        </w:tc>
-      </w:tr>
-      <w:tr>
-        <w:trPr>
-          <w:trHeight w:val="305"/>
-        </w:trPr>
-        <w:tc>
-          <w:tcPr>
-            <w:tcW w:w="3096" w:type="dxa"/>
-          </w:tcPr>
-          <w:p>
-            <w:pPr>
-              <w:spacing w:after="0" w:line="276" w:lineRule="auto"/>
-              <w:ind w:left="1" w:hanging="3"/>
-              <w:jc w:val="both"/>
-              <w:rPr>
-                <w:rFonts w:ascii="Times New Roman" w:eastAsia="Times New Roman" w:hAnsi="Times New Roman"/>
-                <w:sz w:val="26"/>
-                <w:szCs w:val="26"/>
-              </w:rPr>
-            </w:pPr>
-          </w:p>
-        </w:tc>
-        <w:tc>
-          <w:tcPr>
-            <w:tcW w:w="2363" w:type="dxa"/>
-          </w:tcPr>
-          <w:p>
-            <w:pPr>
-              <w:spacing w:after="0" w:line="276" w:lineRule="auto"/>
-              <w:ind w:left="1" w:hanging="3"/>
-              <w:jc w:val="both"/>
-              <w:rPr>
-                <w:rFonts w:ascii="Times New Roman" w:eastAsia="Times New Roman" w:hAnsi="Times New Roman"/>
-                <w:sz w:val="26"/>
-                <w:szCs w:val="26"/>
-              </w:rPr>
-            </w:pPr>
-          </w:p>
-        </w:tc>
-        <w:tc>
-          <w:tcPr>
-            <w:tcW w:w="3381" w:type="dxa"/>
-          </w:tcPr>
-          <w:p>
-            <w:pPr>
-              <w:spacing w:after="0" w:line="276" w:lineRule="auto"/>
-              <w:ind w:left="1" w:hanging="3"/>
-              <w:jc w:val="both"/>
-              <w:rPr>
-                <w:rFonts w:ascii="Times New Roman" w:eastAsia="Times New Roman" w:hAnsi="Times New Roman"/>
-                <w:sz w:val="26"/>
-                <w:szCs w:val="26"/>
-              </w:rPr>
-            </w:pPr>
-          </w:p>
-        </w:tc>
-      </w:tr>
-      <w:tr>
-        <w:trPr>
-          <w:trHeight w:val="305"/>
-        </w:trPr>
-        <w:tc>
-          <w:tcPr>
-            <w:tcW w:w="3096" w:type="dxa"/>
-          </w:tcPr>
-          <w:p>
-            <w:pPr>
-              <w:spacing w:after="0" w:line="276" w:lineRule="auto"/>
-              <w:ind w:left="1" w:hanging="3"/>
-              <w:jc w:val="both"/>
-              <w:rPr>
-                <w:rFonts w:ascii="Times New Roman" w:eastAsia="Times New Roman" w:hAnsi="Times New Roman"/>
-                <w:sz w:val="26"/>
-                <w:szCs w:val="26"/>
-              </w:rPr>
-            </w:pPr>
-          </w:p>
-        </w:tc>
-        <w:tc>
-          <w:tcPr>
-            <w:tcW w:w="2363" w:type="dxa"/>
-          </w:tcPr>
-          <w:p>
-            <w:pPr>
-              <w:spacing w:after="0" w:line="276" w:lineRule="auto"/>
-              <w:ind w:left="1" w:hanging="3"/>
-              <w:jc w:val="both"/>
-              <w:rPr>
-                <w:rFonts w:ascii="Times New Roman" w:eastAsia="Times New Roman" w:hAnsi="Times New Roman"/>
-                <w:sz w:val="26"/>
-                <w:szCs w:val="26"/>
-              </w:rPr>
-            </w:pPr>
-          </w:p>
-        </w:tc>
-        <w:tc>
-          <w:tcPr>
-            <w:tcW w:w="3381" w:type="dxa"/>
-          </w:tcPr>
-          <w:p>
-            <w:pPr>
-              <w:spacing w:after="0" w:line="276" w:lineRule="auto"/>
-              <w:ind w:left="1" w:hanging="3"/>
-              <w:jc w:val="both"/>
-              <w:rPr>
-                <w:rFonts w:ascii="Times New Roman" w:eastAsia="Times New Roman" w:hAnsi="Times New Roman"/>
-                <w:sz w:val="26"/>
-                <w:szCs w:val="26"/>
-              </w:rPr>
-            </w:pPr>
           </w:p>
         </w:tc>
       </w:tr>
     </w:tbl>
     <w:p>
       <w:pPr>
-        <w:spacing w:after="0" w:line="276" w:lineRule="auto"/>
-        <w:ind w:left="1" w:hanging="3"/>
-        <w:rPr>
-          <w:rFonts w:ascii="Times New Roman" w:eastAsia="Times New Roman" w:hAnsi="Times New Roman"/>
-          <w:sz w:val="26"/>
-          <w:szCs w:val="26"/>
-        </w:rPr>
-      </w:pPr>
-    </w:p>
-    <w:tbl>
-      <w:tblPr>
-        <w:tblW w:w="9640" w:type="dxa"/>
-        <w:tblInd w:w="-108" w:type="dxa"/>
-        <w:tblLayout w:type="fixed"/>
-        <w:tblLook w:val="0000" w:firstRow="0" w:lastRow="0" w:firstColumn="0" w:lastColumn="0" w:noHBand="0" w:noVBand="0"/>
-      </w:tblPr>
-      <w:tblGrid>
-        <w:gridCol w:w="3052"/>
-        <w:gridCol w:w="2514"/>
-        <w:gridCol w:w="2241"/>
-        <w:gridCol w:w="1833"/>
-      </w:tblGrid>
-      <w:tr>
-        <w:trPr>
-          <w:trHeight w:val="1849"/>
-        </w:trPr>
-        <w:tc>
-          <w:tcPr>
-            <w:tcW w:w="3052" w:type="dxa"/>
-            <w:vAlign w:val="center"/>
-          </w:tcPr>
-          <w:p>
-            <w:pPr>
-              <w:spacing w:after="0" w:line="276" w:lineRule="auto"/>
-              <w:ind w:hanging="2"/>
-              <w:rPr>
-                <w:rFonts w:ascii="Times New Roman" w:eastAsia="Times New Roman" w:hAnsi="Times New Roman"/>
-              </w:rPr>
-            </w:pPr>
-            <w:r>
-              <w:rPr>
-                <w:rFonts w:ascii="Times New Roman" w:eastAsia="Times New Roman" w:hAnsi="Times New Roman"/>
-                <w:b/>
-                <w:i/>
-              </w:rPr>
-              <w:t xml:space="preserve">Nơi nhận:</w:t>
-            </w:r>
-          </w:p>
-          <w:p>
-            <w:pPr>
-              <w:spacing w:after="0" w:line="276" w:lineRule="auto"/>
-              <w:ind w:hanging="2"/>
-              <w:rPr>
-                <w:rFonts w:ascii="Times New Roman" w:eastAsia="Times New Roman" w:hAnsi="Times New Roman"/>
-              </w:rPr>
-            </w:pPr>
-            <w:r>
-              <w:rPr>
-                <w:rFonts w:ascii="Times New Roman" w:eastAsia="Times New Roman" w:hAnsi="Times New Roman"/>
-              </w:rPr>
-              <w:t>- (</w:t>
-            </w:r>
-            <w:r>
-              <w:rPr>
-                <w:rFonts w:ascii="Times New Roman" w:eastAsia="Times New Roman" w:hAnsi="Times New Roman"/>
-                <w:highlight w:val="yellow"/>
-              </w:rPr>
-              <w:t xml:space="preserve">thêm tên tắt đơn vị CG v nhận CG);</w:t>
-            </w:r>
-          </w:p>
-          <w:p>
-            <w:pPr>
-              <w:spacing w:after="0" w:line="276" w:lineRule="auto"/>
-              <w:ind w:hanging="2"/>
-              <w:rPr>
-                <w:rFonts w:ascii="Times New Roman" w:eastAsia="Times New Roman" w:hAnsi="Times New Roman"/>
-              </w:rPr>
-            </w:pPr>
-            <w:r>
-              <w:rPr>
-                <w:rFonts w:ascii="Times New Roman" w:eastAsia="Times New Roman" w:hAnsi="Times New Roman"/>
-              </w:rPr>
-              <w:t xml:space="preserve">- TCKT;</w:t>
-            </w:r>
-          </w:p>
-          <w:p>
-            <w:pPr>
-              <w:spacing w:after="0" w:line="276" w:lineRule="auto"/>
-              <w:ind w:hanging="2"/>
-              <w:rPr>
-                <w:rFonts w:ascii="Times New Roman" w:eastAsia="Times New Roman" w:hAnsi="Times New Roman"/>
-              </w:rPr>
-            </w:pPr>
-            <w:r>
-              <w:rPr>
-                <w:rFonts w:ascii="Times New Roman" w:eastAsia="Times New Roman" w:hAnsi="Times New Roman"/>
-              </w:rPr>
-              <w:t>- TTDV&amp;ĐTTNCXH;</w:t>
-            </w:r>
-          </w:p>
-          <w:p>
-            <w:pPr>
-              <w:spacing w:after="0" w:line="276" w:lineRule="auto"/>
-              <w:ind w:hanging="2"/>
-              <w:rPr>
-                <w:rFonts w:ascii="Times New Roman" w:eastAsia="Times New Roman" w:hAnsi="Times New Roman"/>
-              </w:rPr>
-            </w:pPr>
-            <w:r>
-              <w:rPr>
-                <w:rFonts w:ascii="Times New Roman" w:eastAsia="Times New Roman" w:hAnsi="Times New Roman"/>
-              </w:rPr>
-              <w:t xml:space="preserve">- Lưu VT, KHCN.</w:t>
-            </w:r>
-          </w:p>
-          <w:p>
-            <w:pPr>
-              <w:spacing w:after="0" w:line="276" w:lineRule="auto"/>
-              <w:ind w:hanging="2"/>
-              <w:jc w:val="center"/>
-              <w:rPr>
-                <w:rFonts w:ascii="Times New Roman" w:eastAsia="Times New Roman" w:hAnsi="Times New Roman"/>
-              </w:rPr>
-            </w:pPr>
-          </w:p>
-        </w:tc>
-        <w:tc>
-          <w:tcPr>
-            <w:tcW w:w="2514" w:type="dxa"/>
-          </w:tcPr>
-          <w:p>
-            <w:pPr>
-              <w:spacing w:after="0" w:line="276" w:lineRule="auto"/>
-              <w:ind w:left="1" w:hanging="3"/>
-              <w:jc w:val="center"/>
-              <w:rPr>
-                <w:rFonts w:ascii="Times New Roman" w:eastAsia="Times New Roman" w:hAnsi="Times New Roman"/>
-                <w:sz w:val="26"/>
-                <w:szCs w:val="26"/>
-              </w:rPr>
-            </w:pPr>
-          </w:p>
-        </w:tc>
-        <w:tc>
-          <w:tcPr>
-            <w:tcW w:w="2241" w:type="dxa"/>
-          </w:tcPr>
-          <w:p>
-            <w:pPr>
-              <w:spacing w:after="0" w:line="276" w:lineRule="auto"/>
-              <w:ind w:left="1" w:hanging="3"/>
-              <w:jc w:val="center"/>
-              <w:rPr>
-                <w:rFonts w:ascii="Times New Roman" w:eastAsia="Times New Roman" w:hAnsi="Times New Roman"/>
-                <w:sz w:val="26"/>
-                <w:szCs w:val="26"/>
-              </w:rPr>
-            </w:pPr>
-            <w:r>
-              <w:rPr>
-                <w:rFonts w:ascii="Times New Roman" w:eastAsia="Times New Roman" w:hAnsi="Times New Roman"/>
-                <w:b/>
-                <w:sz w:val="26"/>
-                <w:szCs w:val="26"/>
-              </w:rPr>
-              <w:t>HIỆU TRƯỞNG</w:t>
-            </w:r>
-          </w:p>
-          <w:p>
-            <w:pPr>
-              <w:spacing w:after="0" w:line="276" w:lineRule="auto"/>
-              <w:ind w:left="1" w:hanging="3"/>
-              <w:jc w:val="center"/>
-              <w:rPr>
-                <w:rFonts w:ascii="Times New Roman" w:eastAsia="Times New Roman" w:hAnsi="Times New Roman"/>
-                <w:sz w:val="26"/>
-                <w:szCs w:val="26"/>
-              </w:rPr>
-            </w:pPr>
-          </w:p>
-          <w:p>
-            <w:pPr>
-              <w:spacing w:after="0" w:line="276" w:lineRule="auto"/>
-              <w:ind w:left="1" w:hanging="3"/>
-              <w:jc w:val="center"/>
-              <w:rPr>
-                <w:rFonts w:ascii="Times New Roman" w:eastAsia="Times New Roman" w:hAnsi="Times New Roman"/>
-                <w:sz w:val="26"/>
-                <w:szCs w:val="26"/>
-              </w:rPr>
-            </w:pPr>
-          </w:p>
-          <w:p>
-            <w:pPr>
-              <w:spacing w:after="0" w:line="276" w:lineRule="auto"/>
-              <w:ind w:left="1" w:hanging="3"/>
-              <w:jc w:val="center"/>
-              <w:rPr>
-                <w:rFonts w:ascii="Times New Roman" w:eastAsia="Times New Roman" w:hAnsi="Times New Roman"/>
-                <w:sz w:val="26"/>
-                <w:szCs w:val="26"/>
-              </w:rPr>
-            </w:pPr>
-          </w:p>
-          <w:p>
-            <w:pPr>
-              <w:spacing w:after="0" w:line="276" w:lineRule="auto"/>
-              <w:ind w:left="1" w:hanging="3"/>
-              <w:jc w:val="center"/>
-              <w:rPr>
-                <w:rFonts w:ascii="Times New Roman" w:eastAsia="Times New Roman" w:hAnsi="Times New Roman"/>
-                <w:sz w:val="26"/>
-                <w:szCs w:val="26"/>
-              </w:rPr>
-            </w:pPr>
-          </w:p>
-          <w:p>
-            <w:pPr>
-              <w:spacing w:after="0" w:line="276" w:lineRule="auto"/>
-              <w:ind w:left="1" w:hanging="3"/>
-              <w:jc w:val="center"/>
-              <w:rPr>
-                <w:rFonts w:ascii="Times New Roman" w:eastAsia="Times New Roman" w:hAnsi="Times New Roman"/>
-                <w:sz w:val="26"/>
-                <w:szCs w:val="26"/>
-              </w:rPr>
-            </w:pPr>
-          </w:p>
-        </w:tc>
-        <w:tc>
-          <w:tcPr>
-            <w:tcW w:w="1833" w:type="dxa"/>
-            <w:vAlign w:val="center"/>
-          </w:tcPr>
-          <w:p>
-            <w:pPr>
-              <w:spacing w:after="0" w:line="276" w:lineRule="auto"/>
-              <w:ind w:left="1" w:hanging="3"/>
-              <w:jc w:val="center"/>
-              <w:rPr>
-                <w:rFonts w:ascii="Times New Roman" w:eastAsia="Times New Roman" w:hAnsi="Times New Roman"/>
-                <w:sz w:val="26"/>
-                <w:szCs w:val="26"/>
-              </w:rPr>
-            </w:pPr>
-          </w:p>
-        </w:tc>
-      </w:tr>
-    </w:tbl>
-    <w:p>
-      <w:pPr>
-        <w:spacing w:after="0" w:line="276" w:lineRule="auto"/>
-        <w:rPr>
-          <w:rFonts w:ascii="Times New Roman" w:eastAsia="Times New Roman" w:hAnsi="Times New Roman"/>
-          <w:sz w:val="26"/>
-          <w:szCs w:val="26"/>
-        </w:rPr>
-      </w:pPr>
-    </w:p>
-    <w:p>
-      <w:pPr>
-        <w:rPr>
-          <w:rFonts w:ascii="Times New Roman" w:hAnsi="Times New Roman"/>
-          <w:sz w:val="26"/>
-          <w:szCs w:val="26"/>
-        </w:rPr>
-      </w:pPr>
-    </w:p>
-    <w:p>
-      <w:pPr>
-        <w:tabs>
-          <w:tab w:val="left" w:pos="5280"/>
-        </w:tabs>
-        <w:rPr>
-          <w:rFonts w:ascii="Times New Roman" w:hAnsi="Times New Roman"/>
-          <w:sz w:val="26"/>
-          <w:szCs w:val="26"/>
-          <w:lang w:val="vi-VN"/>
-        </w:rPr>
-      </w:pPr>
-      <w:r>
-        <w:rPr>
-          <w:rFonts w:ascii="Times New Roman" w:hAnsi="Times New Roman"/>
-          <w:sz w:val="26"/>
-          <w:szCs w:val="26"/>
-        </w:rPr>
-        <w:tab/>
-      </w:r>
+        <w:spacing w:before="0" w:after="0" w:line="20" w:lineRule="exact"/>
+        <w:rPr>
+          <w:sz w:val="2"/>
+          <w:szCs w:val="2"/>
+        </w:rPr>
+      </w:pPr>
     </w:p>
     <w:sectPr>
       <w:footerReference w:type="default" r:id="rId7"/>

</xml_diff>